<commit_message>
Add focused important code documentation
</commit_message>
<xml_diff>
--- a/docs/code-reference-docx/README.md.docx
+++ b/docs/code-reference-docx/README.md.docx
@@ -178,7 +178,7 @@
                 <w:b w:val="0"/>
                 <w:sz w:val="18"/>
               </w:rPr>
-              <w:t>238</w:t>
+              <w:t>242</w:t>
             </w:r>
           </w:p>
         </w:tc>
@@ -214,7 +214,7 @@
                 <w:b w:val="0"/>
                 <w:sz w:val="18"/>
               </w:rPr>
-              <w:t>22,595 bytes</w:t>
+              <w:t>23,192 bytes</w:t>
             </w:r>
           </w:p>
         </w:tc>
@@ -394,7 +394,7 @@
                 <w:b w:val="0"/>
                 <w:sz w:val="18"/>
               </w:rPr>
-              <w:t>67</w:t>
+              <w:t>68</w:t>
             </w:r>
           </w:p>
         </w:tc>
@@ -484,7 +484,7 @@
                 <w:b/>
                 <w:sz w:val="18"/>
               </w:rPr>
-              <w:t>Cloudflare or AI at line 17</w:t>
+              <w:t>Cloudflare or AI at line 20</w:t>
             </w:r>
           </w:p>
         </w:tc>
@@ -520,7 +520,7 @@
                 <w:b/>
                 <w:sz w:val="18"/>
               </w:rPr>
-              <w:t>Installer at line 21</w:t>
+              <w:t>Installer at line 24</w:t>
             </w:r>
           </w:p>
         </w:tc>
@@ -556,7 +556,7 @@
                 <w:b/>
                 <w:sz w:val="18"/>
               </w:rPr>
-              <w:t>Network request at line 24</w:t>
+              <w:t>Network request at line 27</w:t>
             </w:r>
           </w:p>
         </w:tc>
@@ -592,7 +592,7 @@
                 <w:b/>
                 <w:sz w:val="18"/>
               </w:rPr>
-              <w:t>Installer at line 29</w:t>
+              <w:t>Installer at line 32</w:t>
             </w:r>
           </w:p>
         </w:tc>
@@ -628,7 +628,7 @@
                 <w:b/>
                 <w:sz w:val="18"/>
               </w:rPr>
-              <w:t>Installer at line 32</w:t>
+              <w:t>Installer at line 35</w:t>
             </w:r>
           </w:p>
         </w:tc>
@@ -664,7 +664,7 @@
                 <w:b/>
                 <w:sz w:val="18"/>
               </w:rPr>
-              <w:t>Installer at line 35</w:t>
+              <w:t>Installer at line 38</w:t>
             </w:r>
           </w:p>
         </w:tc>
@@ -700,7 +700,7 @@
                 <w:b/>
                 <w:sz w:val="18"/>
               </w:rPr>
-              <w:t>Installer at line 41</w:t>
+              <w:t>Installer at line 44</w:t>
             </w:r>
           </w:p>
         </w:tc>
@@ -736,7 +736,7 @@
                 <w:b/>
                 <w:sz w:val="18"/>
               </w:rPr>
-              <w:t>Installer at line 44</w:t>
+              <w:t>Installer at line 47</w:t>
             </w:r>
           </w:p>
         </w:tc>
@@ -772,7 +772,7 @@
                 <w:b/>
                 <w:sz w:val="18"/>
               </w:rPr>
-              <w:t>Git command at line 46</w:t>
+              <w:t>Git command at line 49</w:t>
             </w:r>
           </w:p>
         </w:tc>
@@ -808,7 +808,7 @@
                 <w:b/>
                 <w:sz w:val="18"/>
               </w:rPr>
-              <w:t>Installer at line 50</w:t>
+              <w:t>Installer at line 53</w:t>
             </w:r>
           </w:p>
         </w:tc>
@@ -844,7 +844,7 @@
                 <w:b/>
                 <w:sz w:val="18"/>
               </w:rPr>
-              <w:t>Network request at line 57</w:t>
+              <w:t>Network request at line 60</w:t>
             </w:r>
           </w:p>
         </w:tc>
@@ -880,7 +880,7 @@
                 <w:b/>
                 <w:sz w:val="18"/>
               </w:rPr>
-              <w:t>Installer at line 62</w:t>
+              <w:t>Installer at line 65</w:t>
             </w:r>
           </w:p>
         </w:tc>
@@ -916,7 +916,7 @@
                 <w:b/>
                 <w:sz w:val="18"/>
               </w:rPr>
-              <w:t>Installer at line 64</w:t>
+              <w:t>Installer at line 67</w:t>
             </w:r>
           </w:p>
         </w:tc>
@@ -952,7 +952,7 @@
                 <w:b/>
                 <w:sz w:val="18"/>
               </w:rPr>
-              <w:t>Installer at line 65</w:t>
+              <w:t>Installer at line 68</w:t>
             </w:r>
           </w:p>
         </w:tc>
@@ -988,7 +988,7 @@
                 <w:b/>
                 <w:sz w:val="18"/>
               </w:rPr>
-              <w:t>Git command at line 66</w:t>
+              <w:t>Git command at line 69</w:t>
             </w:r>
           </w:p>
         </w:tc>
@@ -1024,7 +1024,7 @@
                 <w:b/>
                 <w:sz w:val="18"/>
               </w:rPr>
-              <w:t>Installer at line 67</w:t>
+              <w:t>Installer at line 70</w:t>
             </w:r>
           </w:p>
         </w:tc>
@@ -1060,7 +1060,7 @@
                 <w:b/>
                 <w:sz w:val="18"/>
               </w:rPr>
-              <w:t>Installer at line 69</w:t>
+              <w:t>Installer at line 72</w:t>
             </w:r>
           </w:p>
         </w:tc>
@@ -1096,7 +1096,7 @@
                 <w:b/>
                 <w:sz w:val="18"/>
               </w:rPr>
-              <w:t>Security or auth at line 71</w:t>
+              <w:t>Security or auth at line 74</w:t>
             </w:r>
           </w:p>
         </w:tc>
@@ -1132,7 +1132,7 @@
                 <w:b/>
                 <w:sz w:val="18"/>
               </w:rPr>
-              <w:t>Rich text at line 86</w:t>
+              <w:t>Rich text at line 89</w:t>
             </w:r>
           </w:p>
         </w:tc>
@@ -1168,7 +1168,7 @@
                 <w:b/>
                 <w:sz w:val="18"/>
               </w:rPr>
-              <w:t>Rich text at line 88</w:t>
+              <w:t>Rich text at line 91</w:t>
             </w:r>
           </w:p>
         </w:tc>
@@ -1204,7 +1204,7 @@
                 <w:b/>
                 <w:sz w:val="18"/>
               </w:rPr>
-              <w:t>Compiler or simulator at line 90</w:t>
+              <w:t>Compiler or simulator at line 93</w:t>
             </w:r>
           </w:p>
         </w:tc>
@@ -1240,7 +1240,7 @@
                 <w:b/>
                 <w:sz w:val="18"/>
               </w:rPr>
-              <w:t>Compiler or simulator at line 92</w:t>
+              <w:t>Compiler or simulator at line 95</w:t>
             </w:r>
           </w:p>
         </w:tc>
@@ -1276,7 +1276,7 @@
                 <w:b/>
                 <w:sz w:val="18"/>
               </w:rPr>
-              <w:t>Compiler or simulator at line 94</w:t>
+              <w:t>Compiler or simulator at line 97</w:t>
             </w:r>
           </w:p>
         </w:tc>
@@ -1312,7 +1312,7 @@
                 <w:b/>
                 <w:sz w:val="18"/>
               </w:rPr>
-              <w:t>Compiler or simulator at line 98</w:t>
+              <w:t>Compiler or simulator at line 101</w:t>
             </w:r>
           </w:p>
         </w:tc>
@@ -1348,7 +1348,7 @@
                 <w:b/>
                 <w:sz w:val="18"/>
               </w:rPr>
-              <w:t>Compiler or simulator at line 106</w:t>
+              <w:t>Compiler or simulator at line 109</w:t>
             </w:r>
           </w:p>
         </w:tc>
@@ -1384,7 +1384,7 @@
                 <w:b/>
                 <w:sz w:val="18"/>
               </w:rPr>
-              <w:t>Rich text at line 112</w:t>
+              <w:t>Rich text at line 115</w:t>
             </w:r>
           </w:p>
         </w:tc>
@@ -1420,7 +1420,7 @@
                 <w:b/>
                 <w:sz w:val="18"/>
               </w:rPr>
-              <w:t>Git command at line 116</w:t>
+              <w:t>Git command at line 119</w:t>
             </w:r>
           </w:p>
         </w:tc>
@@ -1456,7 +1456,7 @@
                 <w:b/>
                 <w:sz w:val="18"/>
               </w:rPr>
-              <w:t>Git command at line 124</w:t>
+              <w:t>Git command at line 127</w:t>
             </w:r>
           </w:p>
         </w:tc>
@@ -1492,7 +1492,7 @@
                 <w:b/>
                 <w:sz w:val="18"/>
               </w:rPr>
-              <w:t>Security or auth at line 127</w:t>
+              <w:t>Security or auth at line 130</w:t>
             </w:r>
           </w:p>
         </w:tc>
@@ -1528,7 +1528,7 @@
                 <w:b/>
                 <w:sz w:val="18"/>
               </w:rPr>
-              <w:t>Git command at line 128</w:t>
+              <w:t>Git command at line 131</w:t>
             </w:r>
           </w:p>
         </w:tc>
@@ -1564,7 +1564,7 @@
                 <w:b/>
                 <w:sz w:val="18"/>
               </w:rPr>
-              <w:t>Security or auth at line 132</w:t>
+              <w:t>Security or auth at line 135</w:t>
             </w:r>
           </w:p>
         </w:tc>
@@ -1600,7 +1600,7 @@
                 <w:b/>
                 <w:sz w:val="18"/>
               </w:rPr>
-              <w:t>Git command at line 136</w:t>
+              <w:t>Git command at line 139</w:t>
             </w:r>
           </w:p>
         </w:tc>
@@ -1636,7 +1636,7 @@
                 <w:b/>
                 <w:sz w:val="18"/>
               </w:rPr>
-              <w:t>Git command at line 139</w:t>
+              <w:t>Git command at line 142</w:t>
             </w:r>
           </w:p>
         </w:tc>
@@ -1672,7 +1672,7 @@
                 <w:b/>
                 <w:sz w:val="18"/>
               </w:rPr>
-              <w:t>Installer at line 156</w:t>
+              <w:t>Installer at line 159</w:t>
             </w:r>
           </w:p>
         </w:tc>
@@ -1708,7 +1708,7 @@
                 <w:b/>
                 <w:sz w:val="18"/>
               </w:rPr>
-              <w:t>Installer at line 168</w:t>
+              <w:t>Installer at line 171</w:t>
             </w:r>
           </w:p>
         </w:tc>
@@ -1744,7 +1744,7 @@
                 <w:b/>
                 <w:sz w:val="18"/>
               </w:rPr>
-              <w:t>Installer at line 186</w:t>
+              <w:t>Installer at line 189</w:t>
             </w:r>
           </w:p>
         </w:tc>
@@ -1780,7 +1780,7 @@
                 <w:b/>
                 <w:sz w:val="18"/>
               </w:rPr>
-              <w:t>Rich text at line 192</w:t>
+              <w:t>Rich text at line 195</w:t>
             </w:r>
           </w:p>
         </w:tc>
@@ -1816,7 +1816,7 @@
                 <w:b/>
                 <w:sz w:val="18"/>
               </w:rPr>
-              <w:t>Security or auth at line 193</w:t>
+              <w:t>Security or auth at line 196</w:t>
             </w:r>
           </w:p>
         </w:tc>
@@ -1852,7 +1852,7 @@
                 <w:b/>
                 <w:sz w:val="18"/>
               </w:rPr>
-              <w:t>Security or auth at line 194</w:t>
+              <w:t>Security or auth at line 197</w:t>
             </w:r>
           </w:p>
         </w:tc>
@@ -1888,7 +1888,7 @@
                 <w:b/>
                 <w:sz w:val="18"/>
               </w:rPr>
-              <w:t>Installer at line 195</w:t>
+              <w:t>Installer at line 198</w:t>
             </w:r>
           </w:p>
         </w:tc>
@@ -1924,7 +1924,7 @@
                 <w:b/>
                 <w:sz w:val="18"/>
               </w:rPr>
-              <w:t>Installer at line 196</w:t>
+              <w:t>Installer at line 199</w:t>
             </w:r>
           </w:p>
         </w:tc>
@@ -1960,7 +1960,7 @@
                 <w:b/>
                 <w:sz w:val="18"/>
               </w:rPr>
-              <w:t>Installer at line 197</w:t>
+              <w:t>Installer at line 200</w:t>
             </w:r>
           </w:p>
         </w:tc>
@@ -1996,7 +1996,7 @@
                 <w:b/>
                 <w:sz w:val="18"/>
               </w:rPr>
-              <w:t>Security or auth at line 198</w:t>
+              <w:t>Security or auth at line 201</w:t>
             </w:r>
           </w:p>
         </w:tc>
@@ -2032,7 +2032,7 @@
                 <w:b/>
                 <w:sz w:val="18"/>
               </w:rPr>
-              <w:t>Installer at line 200</w:t>
+              <w:t>Installer at line 203</w:t>
             </w:r>
           </w:p>
         </w:tc>
@@ -2068,7 +2068,7 @@
                 <w:b/>
                 <w:sz w:val="18"/>
               </w:rPr>
-              <w:t>Installer at line 204</w:t>
+              <w:t>Installer at line 207</w:t>
             </w:r>
           </w:p>
         </w:tc>
@@ -2104,7 +2104,7 @@
                 <w:b/>
                 <w:sz w:val="18"/>
               </w:rPr>
-              <w:t>Installer at line 205</w:t>
+              <w:t>Installer at line 208</w:t>
             </w:r>
           </w:p>
         </w:tc>
@@ -2140,7 +2140,7 @@
                 <w:b/>
                 <w:sz w:val="18"/>
               </w:rPr>
-              <w:t>Rich text at line 208</w:t>
+              <w:t>Rich text at line 211</w:t>
             </w:r>
           </w:p>
         </w:tc>
@@ -2176,7 +2176,7 @@
                 <w:b/>
                 <w:sz w:val="18"/>
               </w:rPr>
-              <w:t>Installer at line 212</w:t>
+              <w:t>Installer at line 215</w:t>
             </w:r>
           </w:p>
         </w:tc>
@@ -2212,7 +2212,7 @@
                 <w:b/>
                 <w:sz w:val="18"/>
               </w:rPr>
-              <w:t>Security or auth at line 214</w:t>
+              <w:t>Security or auth at line 217</w:t>
             </w:r>
           </w:p>
         </w:tc>
@@ -2248,7 +2248,7 @@
                 <w:b/>
                 <w:sz w:val="18"/>
               </w:rPr>
-              <w:t>Rich text at line 215</w:t>
+              <w:t>Rich text at line 218</w:t>
             </w:r>
           </w:p>
         </w:tc>
@@ -2284,7 +2284,7 @@
                 <w:b/>
                 <w:sz w:val="18"/>
               </w:rPr>
-              <w:t>Security or auth at line 216</w:t>
+              <w:t>Security or auth at line 219</w:t>
             </w:r>
           </w:p>
         </w:tc>
@@ -2320,7 +2320,7 @@
                 <w:b/>
                 <w:sz w:val="18"/>
               </w:rPr>
-              <w:t>Rich text at line 217</w:t>
+              <w:t>Rich text at line 220</w:t>
             </w:r>
           </w:p>
         </w:tc>
@@ -2356,7 +2356,7 @@
                 <w:b/>
                 <w:sz w:val="18"/>
               </w:rPr>
-              <w:t>Cloudflare or AI at line 218</w:t>
+              <w:t>Cloudflare or AI at line 221</w:t>
             </w:r>
           </w:p>
         </w:tc>
@@ -2392,7 +2392,7 @@
                 <w:b/>
                 <w:sz w:val="18"/>
               </w:rPr>
-              <w:t>Installer at line 219</w:t>
+              <w:t>Installer at line 222</w:t>
             </w:r>
           </w:p>
         </w:tc>
@@ -2428,7 +2428,7 @@
                 <w:b/>
                 <w:sz w:val="18"/>
               </w:rPr>
-              <w:t>Installer at line 220</w:t>
+              <w:t>Installer at line 223</w:t>
             </w:r>
           </w:p>
         </w:tc>
@@ -2464,7 +2464,7 @@
                 <w:b/>
                 <w:sz w:val="18"/>
               </w:rPr>
-              <w:t>Cloudflare or AI at line 221</w:t>
+              <w:t>Cloudflare or AI at line 224</w:t>
             </w:r>
           </w:p>
         </w:tc>
@@ -2500,7 +2500,7 @@
                 <w:b/>
                 <w:sz w:val="18"/>
               </w:rPr>
-              <w:t>Cloudflare or AI at line 222</w:t>
+              <w:t>Cloudflare or AI at line 225</w:t>
             </w:r>
           </w:p>
         </w:tc>
@@ -2536,7 +2536,7 @@
                 <w:b/>
                 <w:sz w:val="18"/>
               </w:rPr>
-              <w:t>Installer at line 223</w:t>
+              <w:t>Installer at line 226</w:t>
             </w:r>
           </w:p>
         </w:tc>
@@ -2572,7 +2572,7 @@
                 <w:b/>
                 <w:sz w:val="18"/>
               </w:rPr>
-              <w:t>Compiler or simulator at line 224</w:t>
+              <w:t>Compiler or simulator at line 227</w:t>
             </w:r>
           </w:p>
         </w:tc>
@@ -2608,7 +2608,7 @@
                 <w:b/>
                 <w:sz w:val="18"/>
               </w:rPr>
-              <w:t>Compiler or simulator at line 225</w:t>
+              <w:t>Compiler or simulator at line 228</w:t>
             </w:r>
           </w:p>
         </w:tc>
@@ -2644,7 +2644,7 @@
                 <w:b/>
                 <w:sz w:val="18"/>
               </w:rPr>
-              <w:t>Compiler or simulator at line 226</w:t>
+              <w:t>Compiler or simulator at line 229</w:t>
             </w:r>
           </w:p>
         </w:tc>
@@ -2680,7 +2680,7 @@
                 <w:b/>
                 <w:sz w:val="18"/>
               </w:rPr>
-              <w:t>Compiler or simulator at line 227</w:t>
+              <w:t>Compiler or simulator at line 230</w:t>
             </w:r>
           </w:p>
         </w:tc>
@@ -2716,7 +2716,7 @@
                 <w:b/>
                 <w:sz w:val="18"/>
               </w:rPr>
-              <w:t>Installer at line 231</w:t>
+              <w:t>Installer at line 234</w:t>
             </w:r>
           </w:p>
         </w:tc>
@@ -2752,7 +2752,7 @@
                 <w:b/>
                 <w:sz w:val="18"/>
               </w:rPr>
-              <w:t>Security or auth at line 232</w:t>
+              <w:t>Security or auth at line 235</w:t>
             </w:r>
           </w:p>
         </w:tc>
@@ -2788,7 +2788,7 @@
                 <w:b/>
                 <w:sz w:val="18"/>
               </w:rPr>
-              <w:t>Security or auth at line 233</w:t>
+              <w:t>Security or auth at line 236</w:t>
             </w:r>
           </w:p>
         </w:tc>
@@ -2824,7 +2824,43 @@
                 <w:b/>
                 <w:sz w:val="18"/>
               </w:rPr>
-              <w:t>Installer at line 236</w:t>
+              <w:t>Cloudflare or AI at line 238</w:t>
+            </w:r>
+          </w:p>
+        </w:tc>
+        <w:tc>
+          <w:tcPr>
+            <w:tcW w:type="dxa" w:w="7128"/>
+            <w:vAlign w:val="center"/>
+          </w:tcPr>
+          <w:p>
+            <w:r/>
+            <w:r>
+              <w:rPr>
+                <w:rFonts w:ascii="Calibri" w:hAnsi="Calibri"/>
+                <w:b w:val="0"/>
+                <w:sz w:val="18"/>
+              </w:rPr>
+              <w:t>Public AI assistant, Worker deployment, or model-provider fallback behavior. Evidence: | `codex/all-file-specific-docs` | Adds focused Word/PDF references for the important code and control files that drive the builder, website, installer, Cloudflare AI worker, workflows, parser, and generated documentatio</w:t>
+            </w:r>
+          </w:p>
+        </w:tc>
+      </w:tr>
+      <w:tr>
+        <w:tc>
+          <w:tcPr>
+            <w:tcW w:type="dxa" w:w="2232"/>
+            <w:vAlign w:val="center"/>
+          </w:tcPr>
+          <w:p>
+            <w:r/>
+            <w:r>
+              <w:rPr>
+                <w:rFonts w:ascii="Calibri" w:hAnsi="Calibri"/>
+                <w:b/>
+                <w:sz w:val="18"/>
+              </w:rPr>
+              <w:t>Installer at line 240</w:t>
             </w:r>
           </w:p>
         </w:tc>
@@ -2860,7 +2896,7 @@
                 <w:b/>
                 <w:sz w:val="18"/>
               </w:rPr>
-              <w:t>Git command at line 238</w:t>
+              <w:t>Git command at line 242</w:t>
             </w:r>
           </w:p>
         </w:tc>
@@ -2923,125 +2959,125 @@
         <w:br/>
         <w:t xml:space="preserve">   12: docs/OMB_Portfolio_Builder_Complete_Guide.docx</w:t>
         <w:br/>
-        <w:t xml:space="preserve">   13: docs/OMB_Portfolio_Builder_Code_Reference.docx</w:t>
+        <w:t xml:space="preserve">   13: docs/OMB_Portfolio_Builder_Complete_Guide.pdf</w:t>
         <w:br/>
-        <w:t xml:space="preserve">   14: docs/OMB_Portfolio_Builder_Code_Reference.pdf</w:t>
+        <w:t xml:space="preserve">   14: docs/OMB_Portfolio_Builder_Code_Reference.docx</w:t>
         <w:br/>
-        <w:t xml:space="preserve">   15: ```</w:t>
+        <w:t xml:space="preserve">   15: docs/OMB_Portfolio_Builder_Code_Reference.pdf</w:t>
         <w:br/>
-        <w:t xml:space="preserve">   16: </w:t>
+        <w:t xml:space="preserve">   16: docs/OMB_Portfolio_Builder_Important_Code_Reference.docx</w:t>
         <w:br/>
-        <w:t xml:space="preserve">   17: It explains the high-level design, generated block diagrams, software-engineering decisions, shell commands, programming syntax, how the important files communicate, what each build tool owns, GitHub workflows, Electron, the installer, caching, API endpoints, data contracts, frontend/backend/AI/Cloudflare layers, the website, the parser, publishing, compiler tools, generated function inventories, and file-by-file repository notes. The generator also writes source-focused Word documents to `docs/code-reference-docx` and PDF documents to `docs/code-reference-pdf`.</w:t>
+        <w:t xml:space="preserve">   17: docs/OMB_Portfolio_Builder_Important_Code_Reference.pdf</w:t>
         <w:br/>
-        <w:t xml:space="preserve">   18: </w:t>
+        <w:t xml:space="preserve">   18: ```</w:t>
         <w:br/>
-        <w:t xml:space="preserve">   19: ## Install</w:t>
+        <w:t xml:space="preserve">   19: </w:t>
         <w:br/>
-        <w:t xml:space="preserve">   20: </w:t>
+        <w:t xml:space="preserve">   20: It explains the high-level design, generated block diagrams, software-engineering decisions, shell commands, programming syntax, how the important files communicate, what each build tool owns, GitHub workflows, Electron, the installer, caching, API endpoints, data contracts, frontend/backend/AI/Cloudflare layers, the website, the parser, publishing, compiler tools, generated function inventories, and file-by-file repository notes. The generator writes source-focused Word documents to `docs/code-reference-docx` and PDFs to `docs/code-reference-pdf`. It also writes a focused important-code reference for the behavior-driving files to `docs/important-code-reference-docx` and `docs/important-code-reference-pdf`.</w:t>
         <w:br/>
-        <w:t xml:space="preserve">   21: Download the latest Windows installer or portable executable from:</w:t>
+        <w:t xml:space="preserve">   21: </w:t>
         <w:br/>
-        <w:t xml:space="preserve">   22: </w:t>
+        <w:t xml:space="preserve">   22: ## Install</w:t>
         <w:br/>
-        <w:t xml:space="preserve">   23: ```text</w:t>
+        <w:t xml:space="preserve">   23: </w:t>
         <w:br/>
-        <w:t xml:space="preserve">   24: https://github.com/otienomaurice/omb-portfolio-builder/releases/latest</w:t>
+        <w:t xml:space="preserve">   24: Download the latest Windows installer or portable executable from:</w:t>
         <w:br/>
-        <w:t xml:space="preserve">   25: ```</w:t>
+        <w:t xml:space="preserve">   25: </w:t>
         <w:br/>
-        <w:t xml:space="preserve">   26: </w:t>
+        <w:t xml:space="preserve">   26: ```text</w:t>
         <w:br/>
-        <w:t xml:space="preserve">   27: Use:</w:t>
+        <w:t xml:space="preserve">   27: https://github.com/otienomaurice/omb-portfolio-builder/releases/latest</w:t>
         <w:br/>
-        <w:t xml:space="preserve">   28: </w:t>
+        <w:t xml:space="preserve">   28: ```</w:t>
         <w:br/>
-        <w:t xml:space="preserve">   29: - `OMB-Portfolio-Builder-Setup-latest-x64.exe` for the Windows installer.</w:t>
+        <w:t xml:space="preserve">   29: </w:t>
         <w:br/>
-        <w:t xml:space="preserve">   30: - `OMB-Portfolio-Builder-Portable-latest-x64.exe` when you want to run without installing.</w:t>
+        <w:t xml:space="preserve">   30: Use:</w:t>
         <w:br/>
         <w:t xml:space="preserve">   31: </w:t>
         <w:br/>
-        <w:t xml:space="preserve">   32: The normal installer default is a per-user AppData location:</w:t>
+        <w:t xml:space="preserve">   32: - `OMB-Portfolio-Builder-Setup-latest-x64.exe` for the Windows installer.</w:t>
         <w:br/>
-        <w:t xml:space="preserve">   33: </w:t>
+        <w:t xml:space="preserve">   33: - `OMB-Portfolio-Builder-Portable-latest-x64.exe` when you want to run without installing.</w:t>
         <w:br/>
-        <w:t xml:space="preserve">   34: ```text</w:t>
+        <w:t xml:space="preserve">   34: </w:t>
         <w:br/>
-        <w:t xml:space="preserve">   35: C:\Users\&lt;you&gt;\AppData\Local\Programs\OMB Portfolio Builder</w:t>
+        <w:t xml:space="preserve">   35: The normal installer default is a per-user AppData location:</w:t>
         <w:br/>
-        <w:t xml:space="preserve">   36: ```</w:t>
+        <w:t xml:space="preserve">   36: </w:t>
         <w:br/>
-        <w:t xml:space="preserve">   37: </w:t>
+        <w:t xml:space="preserve">   37: ```text</w:t>
         <w:br/>
-        <w:t xml:space="preserve">   38: The installed application executable is:</w:t>
+        <w:t xml:space="preserve">   38: C:\Users\&lt;you&gt;\AppData\Local\Programs\OMB Portfolio Builder</w:t>
         <w:br/>
-        <w:t xml:space="preserve">   39: </w:t>
+        <w:t xml:space="preserve">   39: ```</w:t>
         <w:br/>
-        <w:t xml:space="preserve">   40: ```text</w:t>
+        <w:t xml:space="preserve">   40: </w:t>
         <w:br/>
-        <w:t xml:space="preserve">   41: C:\Users\&lt;you&gt;\AppData\Local\Programs\OMB Portfolio Builder\OMB Portfolio Builder.exe</w:t>
+        <w:t xml:space="preserve">   41: The installed application executable is:</w:t>
         <w:br/>
-        <w:t xml:space="preserve">   42: ```</w:t>
+        <w:t xml:space="preserve">   42: </w:t>
         <w:br/>
-        <w:t xml:space="preserve">   43: </w:t>
+        <w:t xml:space="preserve">   43: ```text</w:t>
         <w:br/>
-        <w:t xml:space="preserve">   44: The installer uses a Windows wizard with Back, Next, Cancel, progress, and Finish. It can create Desktop and Start Menu shortcuts, and it writes a normal Windows uninstall entry. The default per-user install does not write into `C:\Program Files`, so normal app updates can run without a Windows administrator prompt.</w:t>
+        <w:t xml:space="preserve">   44: C:\Users\&lt;you&gt;\AppData\Local\Programs\OMB Portfolio Builder\OMB Portfolio Builder.exe</w:t>
         <w:br/>
-        <w:t xml:space="preserve">   45: </w:t>
+        <w:t xml:space="preserve">   45: ```</w:t>
         <w:br/>
-        <w:t xml:space="preserve">   46: Installed users do not need Node.js or pnpm. The packaged desktop app includes its runtime. Git for Windows with Git Credential Manager is needed only for publishing to a Git repository. If Git or Git Credential Manager is missing, setup can install Git for Windows; compatible existing tools are skipped rather than removed.</w:t>
+        <w:t xml:space="preserve">   46: </w:t>
         <w:br/>
-        <w:t xml:space="preserve">   47: </w:t>
+        <w:t xml:space="preserve">   47: The installer uses a Windows wizard with Back, Next, Cancel, progress, and Finish. It can create Desktop and Start Menu shortcuts, and it writes a normal Windows uninstall entry. The default per-user install does not write into `C:\Program Files`, so normal app updates can run without a Windows administrator prompt.</w:t>
         <w:br/>
-        <w:t xml:space="preserve">   48: ## Updates</w:t>
+        <w:t xml:space="preserve">   48: </w:t>
         <w:br/>
-        <w:t xml:space="preserve">   49: </w:t>
+        <w:t xml:space="preserve">   49: Installed users do not need Node.js or pnpm. The packaged desktop app includes its runtime. Git for Windows with Git Credential Manager is needed only for publishing to a Git repository. If Git or Git Credential Manager is missing, setup can install Git for Windows; compatible existing tools are skipped rather than removed.</w:t>
         <w:br/>
-        <w:t xml:space="preserve">   50: The app checks GitHub Releases for newer builder versions. When a newer release exists, the app shows an update dialog. Choosing **Update** downloads the installer, closes the running builder, updates the existing installation in place, and reopens the updated app.</w:t>
+        <w:t xml:space="preserve">   50: </w:t>
         <w:br/>
-        <w:t xml:space="preserve">   51: </w:t>
+        <w:t xml:space="preserve">   51: ## Updates</w:t>
         <w:br/>
-        <w:t xml:space="preserve">   52: Setup treats an existing install as an update target, not a second installation. It checks the current user's install first, then legacy machine-wide records, uses the detected install location for updates, avoids creating duplicate builder copies, and stops when the installed version is already current or newer.</w:t>
+        <w:t xml:space="preserve">   52: </w:t>
         <w:br/>
-        <w:t xml:space="preserve">   53: </w:t>
+        <w:t xml:space="preserve">   53: The app checks GitHub Releases for newer builder versions. When a newer release exists, the app shows an update dialog. Choosing **Update** downloads the installer, closes the running builder, updates the existing installation in place, and reopens the updated app.</w:t>
         <w:br/>
-        <w:t xml:space="preserve">   54: Older releases remain available at:</w:t>
+        <w:t xml:space="preserve">   54: </w:t>
         <w:br/>
-        <w:t xml:space="preserve">   55: </w:t>
+        <w:t xml:space="preserve">   55: Setup treats an existing install as an update target, not a second installation. It checks the current user's install first, then legacy machine-wide records, uses the detected install location for updates, avoids creating duplicate builder copies, and stops when the installed version is already current or newer.</w:t>
         <w:br/>
-        <w:t xml:space="preserve">   56: ```text</w:t>
+        <w:t xml:space="preserve">   56: </w:t>
         <w:br/>
-        <w:t xml:space="preserve">   57: https://github.com/otienomaurice/omb-portfolio-builder/releases</w:t>
+        <w:t xml:space="preserve">   57: Older releases remain available at:</w:t>
         <w:br/>
-        <w:t xml:space="preserve">   58: ```</w:t>
+        <w:t xml:space="preserve">   58: </w:t>
         <w:br/>
-        <w:t xml:space="preserve">   59: </w:t>
+        <w:t xml:space="preserve">   59: ```text</w:t>
         <w:br/>
-        <w:t xml:space="preserve">   60: ## Local Workspaces</w:t>
+        <w:t xml:space="preserve">   60: https://github.com/otienomaurice/omb-portfolio-builder/releases</w:t>
         <w:br/>
-        <w:t xml:space="preserve">   61: </w:t>
+        <w:t xml:space="preserve">   61: ```</w:t>
         <w:br/>
-        <w:t xml:space="preserve">   62: On Windows, the app keeps application files and editable content under AppData:</w:t>
+        <w:t xml:space="preserve">   62: </w:t>
         <w:br/>
-        <w:t xml:space="preserve">   63: </w:t>
+        <w:t xml:space="preserve">   63: ## Local Workspaces</w:t>
         <w:br/>
-        <w:t xml:space="preserve">   64: - `C:\Users\&lt;you&gt;\AppData\Local\Programs\OMB Portfolio Builder` stores the installed desktop application.</w:t>
+        <w:t xml:space="preserve">   64: </w:t>
         <w:br/>
-        <w:t xml:space="preserve">   65: - `C:\Users\&lt;you&gt;\AppData\Local\OMB Portfolio Builder\builder` stores the builder workspace, local drafts, uploaded files, templates, previews, and editing tools.</w:t>
+        <w:t xml:space="preserve">   65: On Windows, the app keeps application files and editable content under AppData:</w:t>
         <w:br/>
-        <w:t xml:space="preserve">   66: - `C:\Users\&lt;you&gt;\AppData\Local\OMB Portfolio Builder\portfolio` stores the publish mirror used by Git-based publishing.</w:t>
+        <w:t xml:space="preserve">   66: </w:t>
         <w:br/>
-        <w:t xml:space="preserve">   67: - `C:\Users\&lt;you&gt;\AppData\Local\OMB Portfolio Builder\compile-code` stores project compile-workspace source files and run folders created by the Compile Code tool.</w:t>
+        <w:t xml:space="preserve">   67: - `C:\Users\&lt;you&gt;\AppData\Local\Programs\OMB Portfolio Builder` stores the installed desktop application.</w:t>
         <w:br/>
-        <w:t xml:space="preserve">   68: </w:t>
+        <w:t xml:space="preserve">   68: - `C:\Users\&lt;you&gt;\AppData\Local\OMB Portfolio Builder\builder` stores the builder workspace, local drafts, uploaded files, templates, previews, and editing tools.</w:t>
         <w:br/>
-        <w:t xml:space="preserve">   69: The installer and updater treat the AppData builder and portfolio folders as managed workspaces, not duplicate app installs.</w:t>
+        <w:t xml:space="preserve">   69: - `C:\Users\&lt;you&gt;\AppData\Local\OMB Portfolio Builder\portfolio` stores the publish mirror used by Git-based publishing.</w:t>
         <w:br/>
-        <w:t xml:space="preserve">   70: </w:t>
+        <w:t xml:space="preserve">   70: - `C:\Users\&lt;you&gt;\AppData\Local\OMB Portfolio Builder\compile-code` stores project compile-workspace source files and run folders created by the Compile Code tool.</w:t>
         <w:br/>
-        <w:t xml:space="preserve">   71: The builder works offline for editing, project creation, file attachment, local previews, and draft saves. Publishing requires network access and repository write permission.</w:t>
+        <w:t xml:space="preserve">   71: </w:t>
         <w:br/>
-        <w:t xml:space="preserve">   72:</w:t>
+        <w:t xml:space="preserve">   72: The installer and updater treat the AppData builder and portfolio folders as managed workspaces, not duplicate app installs.</w:t>
       </w:r>
     </w:p>
     <w:p>

</xml_diff>

<commit_message>
Curate generated file reference docs
</commit_message>
<xml_diff>
--- a/docs/code-reference-docx/README.md.docx
+++ b/docs/code-reference-docx/README.md.docx
@@ -178,7 +178,7 @@
                 <w:b w:val="0"/>
                 <w:sz w:val="18"/>
               </w:rPr>
-              <w:t>242</w:t>
+              <w:t>253</w:t>
             </w:r>
           </w:p>
         </w:tc>
@@ -214,7 +214,7 @@
                 <w:b w:val="0"/>
                 <w:sz w:val="18"/>
               </w:rPr>
-              <w:t>23,192 bytes</w:t>
+              <w:t>23,960 bytes</w:t>
             </w:r>
           </w:p>
         </w:tc>
@@ -394,7 +394,7 @@
                 <w:b w:val="0"/>
                 <w:sz w:val="18"/>
               </w:rPr>
-              <w:t>68</w:t>
+              <w:t>69</w:t>
             </w:r>
           </w:p>
         </w:tc>
@@ -484,7 +484,7 @@
                 <w:b/>
                 <w:sz w:val="18"/>
               </w:rPr>
-              <w:t>Cloudflare or AI at line 20</w:t>
+              <w:t>Cloudflare or AI at line 22</w:t>
             </w:r>
           </w:p>
         </w:tc>
@@ -501,7 +501,7 @@
                 <w:b w:val="0"/>
                 <w:sz w:val="18"/>
               </w:rPr>
-              <w:t>Public AI assistant, Worker deployment, or model-provider fallback behavior. Evidence: It explains the high-level design, generated block diagrams, software-engineering decisions, shell commands, programming syntax, how the important files communicate, what each build tool owns, GitHub workflows, Electron,</w:t>
+              <w:t>Public AI assistant, Worker deployment, or model-provider fallback behavior. Evidence: The complete guide explains the whole system: high-level design, generated block diagrams, software-engineering decisions, shell commands, programming syntax, how the important files communicate, what each build tool own</w:t>
             </w:r>
           </w:p>
         </w:tc>
@@ -520,7 +520,7 @@
                 <w:b/>
                 <w:sz w:val="18"/>
               </w:rPr>
-              <w:t>Installer at line 24</w:t>
+              <w:t>Installer at line 34</w:t>
             </w:r>
           </w:p>
         </w:tc>
@@ -556,7 +556,7 @@
                 <w:b/>
                 <w:sz w:val="18"/>
               </w:rPr>
-              <w:t>Network request at line 27</w:t>
+              <w:t>Network request at line 37</w:t>
             </w:r>
           </w:p>
         </w:tc>
@@ -592,7 +592,7 @@
                 <w:b/>
                 <w:sz w:val="18"/>
               </w:rPr>
-              <w:t>Installer at line 32</w:t>
+              <w:t>Installer at line 42</w:t>
             </w:r>
           </w:p>
         </w:tc>
@@ -628,7 +628,7 @@
                 <w:b/>
                 <w:sz w:val="18"/>
               </w:rPr>
-              <w:t>Installer at line 35</w:t>
+              <w:t>Installer at line 45</w:t>
             </w:r>
           </w:p>
         </w:tc>
@@ -664,7 +664,7 @@
                 <w:b/>
                 <w:sz w:val="18"/>
               </w:rPr>
-              <w:t>Installer at line 38</w:t>
+              <w:t>Installer at line 48</w:t>
             </w:r>
           </w:p>
         </w:tc>
@@ -700,7 +700,7 @@
                 <w:b/>
                 <w:sz w:val="18"/>
               </w:rPr>
-              <w:t>Installer at line 44</w:t>
+              <w:t>Installer at line 54</w:t>
             </w:r>
           </w:p>
         </w:tc>
@@ -736,7 +736,7 @@
                 <w:b/>
                 <w:sz w:val="18"/>
               </w:rPr>
-              <w:t>Installer at line 47</w:t>
+              <w:t>Installer at line 57</w:t>
             </w:r>
           </w:p>
         </w:tc>
@@ -772,7 +772,7 @@
                 <w:b/>
                 <w:sz w:val="18"/>
               </w:rPr>
-              <w:t>Git command at line 49</w:t>
+              <w:t>Git command at line 59</w:t>
             </w:r>
           </w:p>
         </w:tc>
@@ -808,7 +808,7 @@
                 <w:b/>
                 <w:sz w:val="18"/>
               </w:rPr>
-              <w:t>Installer at line 53</w:t>
+              <w:t>Installer at line 63</w:t>
             </w:r>
           </w:p>
         </w:tc>
@@ -844,7 +844,7 @@
                 <w:b/>
                 <w:sz w:val="18"/>
               </w:rPr>
-              <w:t>Network request at line 60</w:t>
+              <w:t>Network request at line 70</w:t>
             </w:r>
           </w:p>
         </w:tc>
@@ -880,7 +880,7 @@
                 <w:b/>
                 <w:sz w:val="18"/>
               </w:rPr>
-              <w:t>Installer at line 65</w:t>
+              <w:t>Installer at line 75</w:t>
             </w:r>
           </w:p>
         </w:tc>
@@ -916,7 +916,7 @@
                 <w:b/>
                 <w:sz w:val="18"/>
               </w:rPr>
-              <w:t>Installer at line 67</w:t>
+              <w:t>Installer at line 77</w:t>
             </w:r>
           </w:p>
         </w:tc>
@@ -952,7 +952,7 @@
                 <w:b/>
                 <w:sz w:val="18"/>
               </w:rPr>
-              <w:t>Installer at line 68</w:t>
+              <w:t>Installer at line 78</w:t>
             </w:r>
           </w:p>
         </w:tc>
@@ -988,7 +988,7 @@
                 <w:b/>
                 <w:sz w:val="18"/>
               </w:rPr>
-              <w:t>Git command at line 69</w:t>
+              <w:t>Git command at line 79</w:t>
             </w:r>
           </w:p>
         </w:tc>
@@ -1024,7 +1024,7 @@
                 <w:b/>
                 <w:sz w:val="18"/>
               </w:rPr>
-              <w:t>Installer at line 70</w:t>
+              <w:t>Installer at line 80</w:t>
             </w:r>
           </w:p>
         </w:tc>
@@ -1060,7 +1060,7 @@
                 <w:b/>
                 <w:sz w:val="18"/>
               </w:rPr>
-              <w:t>Installer at line 72</w:t>
+              <w:t>Installer at line 82</w:t>
             </w:r>
           </w:p>
         </w:tc>
@@ -1096,7 +1096,7 @@
                 <w:b/>
                 <w:sz w:val="18"/>
               </w:rPr>
-              <w:t>Security or auth at line 74</w:t>
+              <w:t>Security or auth at line 84</w:t>
             </w:r>
           </w:p>
         </w:tc>
@@ -1132,7 +1132,7 @@
                 <w:b/>
                 <w:sz w:val="18"/>
               </w:rPr>
-              <w:t>Rich text at line 89</w:t>
+              <w:t>Rich text at line 99</w:t>
             </w:r>
           </w:p>
         </w:tc>
@@ -1168,7 +1168,7 @@
                 <w:b/>
                 <w:sz w:val="18"/>
               </w:rPr>
-              <w:t>Rich text at line 91</w:t>
+              <w:t>Rich text at line 101</w:t>
             </w:r>
           </w:p>
         </w:tc>
@@ -1204,7 +1204,7 @@
                 <w:b/>
                 <w:sz w:val="18"/>
               </w:rPr>
-              <w:t>Compiler or simulator at line 93</w:t>
+              <w:t>Compiler or simulator at line 103</w:t>
             </w:r>
           </w:p>
         </w:tc>
@@ -1240,7 +1240,7 @@
                 <w:b/>
                 <w:sz w:val="18"/>
               </w:rPr>
-              <w:t>Compiler or simulator at line 95</w:t>
+              <w:t>Compiler or simulator at line 105</w:t>
             </w:r>
           </w:p>
         </w:tc>
@@ -1276,7 +1276,7 @@
                 <w:b/>
                 <w:sz w:val="18"/>
               </w:rPr>
-              <w:t>Compiler or simulator at line 97</w:t>
+              <w:t>Compiler or simulator at line 107</w:t>
             </w:r>
           </w:p>
         </w:tc>
@@ -1312,7 +1312,7 @@
                 <w:b/>
                 <w:sz w:val="18"/>
               </w:rPr>
-              <w:t>Compiler or simulator at line 101</w:t>
+              <w:t>Compiler or simulator at line 111</w:t>
             </w:r>
           </w:p>
         </w:tc>
@@ -1348,7 +1348,7 @@
                 <w:b/>
                 <w:sz w:val="18"/>
               </w:rPr>
-              <w:t>Compiler or simulator at line 109</w:t>
+              <w:t>Compiler or simulator at line 119</w:t>
             </w:r>
           </w:p>
         </w:tc>
@@ -1384,7 +1384,7 @@
                 <w:b/>
                 <w:sz w:val="18"/>
               </w:rPr>
-              <w:t>Rich text at line 115</w:t>
+              <w:t>Rich text at line 125</w:t>
             </w:r>
           </w:p>
         </w:tc>
@@ -1420,7 +1420,7 @@
                 <w:b/>
                 <w:sz w:val="18"/>
               </w:rPr>
-              <w:t>Git command at line 119</w:t>
+              <w:t>Git command at line 129</w:t>
             </w:r>
           </w:p>
         </w:tc>
@@ -1456,7 +1456,7 @@
                 <w:b/>
                 <w:sz w:val="18"/>
               </w:rPr>
-              <w:t>Git command at line 127</w:t>
+              <w:t>Git command at line 137</w:t>
             </w:r>
           </w:p>
         </w:tc>
@@ -1492,7 +1492,7 @@
                 <w:b/>
                 <w:sz w:val="18"/>
               </w:rPr>
-              <w:t>Security or auth at line 130</w:t>
+              <w:t>Security or auth at line 140</w:t>
             </w:r>
           </w:p>
         </w:tc>
@@ -1528,7 +1528,7 @@
                 <w:b/>
                 <w:sz w:val="18"/>
               </w:rPr>
-              <w:t>Git command at line 131</w:t>
+              <w:t>Git command at line 141</w:t>
             </w:r>
           </w:p>
         </w:tc>
@@ -1564,7 +1564,7 @@
                 <w:b/>
                 <w:sz w:val="18"/>
               </w:rPr>
-              <w:t>Security or auth at line 135</w:t>
+              <w:t>Security or auth at line 145</w:t>
             </w:r>
           </w:p>
         </w:tc>
@@ -1600,7 +1600,7 @@
                 <w:b/>
                 <w:sz w:val="18"/>
               </w:rPr>
-              <w:t>Git command at line 139</w:t>
+              <w:t>Git command at line 149</w:t>
             </w:r>
           </w:p>
         </w:tc>
@@ -1636,7 +1636,7 @@
                 <w:b/>
                 <w:sz w:val="18"/>
               </w:rPr>
-              <w:t>Git command at line 142</w:t>
+              <w:t>Git command at line 152</w:t>
             </w:r>
           </w:p>
         </w:tc>
@@ -1672,7 +1672,7 @@
                 <w:b/>
                 <w:sz w:val="18"/>
               </w:rPr>
-              <w:t>Installer at line 159</w:t>
+              <w:t>Installer at line 169</w:t>
             </w:r>
           </w:p>
         </w:tc>
@@ -1708,7 +1708,7 @@
                 <w:b/>
                 <w:sz w:val="18"/>
               </w:rPr>
-              <w:t>Installer at line 171</w:t>
+              <w:t>Installer at line 181</w:t>
             </w:r>
           </w:p>
         </w:tc>
@@ -1744,7 +1744,7 @@
                 <w:b/>
                 <w:sz w:val="18"/>
               </w:rPr>
-              <w:t>Installer at line 189</w:t>
+              <w:t>Installer at line 199</w:t>
             </w:r>
           </w:p>
         </w:tc>
@@ -1780,7 +1780,7 @@
                 <w:b/>
                 <w:sz w:val="18"/>
               </w:rPr>
-              <w:t>Rich text at line 195</w:t>
+              <w:t>Rich text at line 205</w:t>
             </w:r>
           </w:p>
         </w:tc>
@@ -1816,7 +1816,7 @@
                 <w:b/>
                 <w:sz w:val="18"/>
               </w:rPr>
-              <w:t>Security or auth at line 196</w:t>
+              <w:t>Security or auth at line 206</w:t>
             </w:r>
           </w:p>
         </w:tc>
@@ -1852,7 +1852,7 @@
                 <w:b/>
                 <w:sz w:val="18"/>
               </w:rPr>
-              <w:t>Security or auth at line 197</w:t>
+              <w:t>Security or auth at line 207</w:t>
             </w:r>
           </w:p>
         </w:tc>
@@ -1888,7 +1888,7 @@
                 <w:b/>
                 <w:sz w:val="18"/>
               </w:rPr>
-              <w:t>Installer at line 198</w:t>
+              <w:t>Installer at line 208</w:t>
             </w:r>
           </w:p>
         </w:tc>
@@ -1924,7 +1924,7 @@
                 <w:b/>
                 <w:sz w:val="18"/>
               </w:rPr>
-              <w:t>Installer at line 199</w:t>
+              <w:t>Installer at line 209</w:t>
             </w:r>
           </w:p>
         </w:tc>
@@ -1960,7 +1960,7 @@
                 <w:b/>
                 <w:sz w:val="18"/>
               </w:rPr>
-              <w:t>Installer at line 200</w:t>
+              <w:t>Installer at line 210</w:t>
             </w:r>
           </w:p>
         </w:tc>
@@ -1996,7 +1996,7 @@
                 <w:b/>
                 <w:sz w:val="18"/>
               </w:rPr>
-              <w:t>Security or auth at line 201</w:t>
+              <w:t>Security or auth at line 211</w:t>
             </w:r>
           </w:p>
         </w:tc>
@@ -2032,7 +2032,7 @@
                 <w:b/>
                 <w:sz w:val="18"/>
               </w:rPr>
-              <w:t>Installer at line 203</w:t>
+              <w:t>Installer at line 213</w:t>
             </w:r>
           </w:p>
         </w:tc>
@@ -2068,7 +2068,7 @@
                 <w:b/>
                 <w:sz w:val="18"/>
               </w:rPr>
-              <w:t>Installer at line 207</w:t>
+              <w:t>Installer at line 217</w:t>
             </w:r>
           </w:p>
         </w:tc>
@@ -2104,7 +2104,7 @@
                 <w:b/>
                 <w:sz w:val="18"/>
               </w:rPr>
-              <w:t>Installer at line 208</w:t>
+              <w:t>Installer at line 218</w:t>
             </w:r>
           </w:p>
         </w:tc>
@@ -2140,7 +2140,7 @@
                 <w:b/>
                 <w:sz w:val="18"/>
               </w:rPr>
-              <w:t>Rich text at line 211</w:t>
+              <w:t>Rich text at line 221</w:t>
             </w:r>
           </w:p>
         </w:tc>
@@ -2176,7 +2176,7 @@
                 <w:b/>
                 <w:sz w:val="18"/>
               </w:rPr>
-              <w:t>Installer at line 215</w:t>
+              <w:t>Installer at line 225</w:t>
             </w:r>
           </w:p>
         </w:tc>
@@ -2212,7 +2212,7 @@
                 <w:b/>
                 <w:sz w:val="18"/>
               </w:rPr>
-              <w:t>Security or auth at line 217</w:t>
+              <w:t>Security or auth at line 227</w:t>
             </w:r>
           </w:p>
         </w:tc>
@@ -2248,7 +2248,7 @@
                 <w:b/>
                 <w:sz w:val="18"/>
               </w:rPr>
-              <w:t>Rich text at line 218</w:t>
+              <w:t>Rich text at line 228</w:t>
             </w:r>
           </w:p>
         </w:tc>
@@ -2284,7 +2284,7 @@
                 <w:b/>
                 <w:sz w:val="18"/>
               </w:rPr>
-              <w:t>Security or auth at line 219</w:t>
+              <w:t>Security or auth at line 229</w:t>
             </w:r>
           </w:p>
         </w:tc>
@@ -2320,7 +2320,7 @@
                 <w:b/>
                 <w:sz w:val="18"/>
               </w:rPr>
-              <w:t>Rich text at line 220</w:t>
+              <w:t>Rich text at line 230</w:t>
             </w:r>
           </w:p>
         </w:tc>
@@ -2356,7 +2356,7 @@
                 <w:b/>
                 <w:sz w:val="18"/>
               </w:rPr>
-              <w:t>Cloudflare or AI at line 221</w:t>
+              <w:t>Cloudflare or AI at line 231</w:t>
             </w:r>
           </w:p>
         </w:tc>
@@ -2392,7 +2392,7 @@
                 <w:b/>
                 <w:sz w:val="18"/>
               </w:rPr>
-              <w:t>Installer at line 222</w:t>
+              <w:t>Installer at line 232</w:t>
             </w:r>
           </w:p>
         </w:tc>
@@ -2428,7 +2428,7 @@
                 <w:b/>
                 <w:sz w:val="18"/>
               </w:rPr>
-              <w:t>Installer at line 223</w:t>
+              <w:t>Installer at line 233</w:t>
             </w:r>
           </w:p>
         </w:tc>
@@ -2464,7 +2464,7 @@
                 <w:b/>
                 <w:sz w:val="18"/>
               </w:rPr>
-              <w:t>Cloudflare or AI at line 224</w:t>
+              <w:t>Cloudflare or AI at line 234</w:t>
             </w:r>
           </w:p>
         </w:tc>
@@ -2500,7 +2500,7 @@
                 <w:b/>
                 <w:sz w:val="18"/>
               </w:rPr>
-              <w:t>Cloudflare or AI at line 225</w:t>
+              <w:t>Cloudflare or AI at line 235</w:t>
             </w:r>
           </w:p>
         </w:tc>
@@ -2536,7 +2536,7 @@
                 <w:b/>
                 <w:sz w:val="18"/>
               </w:rPr>
-              <w:t>Installer at line 226</w:t>
+              <w:t>Installer at line 236</w:t>
             </w:r>
           </w:p>
         </w:tc>
@@ -2572,7 +2572,7 @@
                 <w:b/>
                 <w:sz w:val="18"/>
               </w:rPr>
-              <w:t>Compiler or simulator at line 227</w:t>
+              <w:t>Compiler or simulator at line 237</w:t>
             </w:r>
           </w:p>
         </w:tc>
@@ -2608,7 +2608,7 @@
                 <w:b/>
                 <w:sz w:val="18"/>
               </w:rPr>
-              <w:t>Compiler or simulator at line 228</w:t>
+              <w:t>Compiler or simulator at line 238</w:t>
             </w:r>
           </w:p>
         </w:tc>
@@ -2644,7 +2644,7 @@
                 <w:b/>
                 <w:sz w:val="18"/>
               </w:rPr>
-              <w:t>Compiler or simulator at line 229</w:t>
+              <w:t>Compiler or simulator at line 239</w:t>
             </w:r>
           </w:p>
         </w:tc>
@@ -2680,7 +2680,7 @@
                 <w:b/>
                 <w:sz w:val="18"/>
               </w:rPr>
-              <w:t>Compiler or simulator at line 230</w:t>
+              <w:t>Compiler or simulator at line 240</w:t>
             </w:r>
           </w:p>
         </w:tc>
@@ -2716,7 +2716,7 @@
                 <w:b/>
                 <w:sz w:val="18"/>
               </w:rPr>
-              <w:t>Installer at line 234</w:t>
+              <w:t>Installer at line 244</w:t>
             </w:r>
           </w:p>
         </w:tc>
@@ -2752,7 +2752,7 @@
                 <w:b/>
                 <w:sz w:val="18"/>
               </w:rPr>
-              <w:t>Security or auth at line 235</w:t>
+              <w:t>Security or auth at line 245</w:t>
             </w:r>
           </w:p>
         </w:tc>
@@ -2788,7 +2788,7 @@
                 <w:b/>
                 <w:sz w:val="18"/>
               </w:rPr>
-              <w:t>Security or auth at line 236</w:t>
+              <w:t>Security or auth at line 246</w:t>
             </w:r>
           </w:p>
         </w:tc>
@@ -2824,7 +2824,7 @@
                 <w:b/>
                 <w:sz w:val="18"/>
               </w:rPr>
-              <w:t>Cloudflare or AI at line 238</w:t>
+              <w:t>Cloudflare or AI at line 248</w:t>
             </w:r>
           </w:p>
         </w:tc>
@@ -2860,7 +2860,43 @@
                 <w:b/>
                 <w:sz w:val="18"/>
               </w:rPr>
-              <w:t>Installer at line 240</w:t>
+              <w:t>Cloudflare or AI at line 249</w:t>
+            </w:r>
+          </w:p>
+        </w:tc>
+        <w:tc>
+          <w:tcPr>
+            <w:tcW w:type="dxa" w:w="7128"/>
+            <w:vAlign w:val="center"/>
+          </w:tcPr>
+          <w:p>
+            <w:r/>
+            <w:r>
+              <w:rPr>
+                <w:rFonts w:ascii="Calibri" w:hAnsi="Calibri"/>
+                <w:b w:val="0"/>
+                <w:sz w:val="18"/>
+              </w:rPr>
+              <w:t>Public AI assistant, Worker deployment, or model-provider fallback behavior. Evidence: | `codex/narrative-important-function-docs` | Splits the documentation model so the complete guide explains the whole system while generated per-file Word/PDF references explain each file's own contents, functions, varia</w:t>
+            </w:r>
+          </w:p>
+        </w:tc>
+      </w:tr>
+      <w:tr>
+        <w:tc>
+          <w:tcPr>
+            <w:tcW w:type="dxa" w:w="2232"/>
+            <w:vAlign w:val="center"/>
+          </w:tcPr>
+          <w:p>
+            <w:r/>
+            <w:r>
+              <w:rPr>
+                <w:rFonts w:ascii="Calibri" w:hAnsi="Calibri"/>
+                <w:b/>
+                <w:sz w:val="18"/>
+              </w:rPr>
+              <w:t>Installer at line 251</w:t>
             </w:r>
           </w:p>
         </w:tc>
@@ -2896,7 +2932,7 @@
                 <w:b/>
                 <w:sz w:val="18"/>
               </w:rPr>
-              <w:t>Git command at line 242</w:t>
+              <w:t>Git command at line 253</w:t>
             </w:r>
           </w:p>
         </w:tc>
@@ -2961,123 +2997,123 @@
         <w:br/>
         <w:t xml:space="preserve">   13: docs/OMB_Portfolio_Builder_Complete_Guide.pdf</w:t>
         <w:br/>
-        <w:t xml:space="preserve">   14: docs/OMB_Portfolio_Builder_Code_Reference.docx</w:t>
+        <w:t xml:space="preserve">   14: docs/OMB_Portfolio_Builder_File_Reference.docx</w:t>
         <w:br/>
-        <w:t xml:space="preserve">   15: docs/OMB_Portfolio_Builder_Code_Reference.pdf</w:t>
+        <w:t xml:space="preserve">   15: docs/OMB_Portfolio_Builder_File_Reference.pdf</w:t>
         <w:br/>
-        <w:t xml:space="preserve">   16: docs/OMB_Portfolio_Builder_Important_Code_Reference.docx</w:t>
+        <w:t xml:space="preserve">   16: docs/OMB_Portfolio_Builder_Code_Reference.docx</w:t>
         <w:br/>
-        <w:t xml:space="preserve">   17: docs/OMB_Portfolio_Builder_Important_Code_Reference.pdf</w:t>
+        <w:t xml:space="preserve">   17: docs/OMB_Portfolio_Builder_Code_Reference.pdf</w:t>
         <w:br/>
-        <w:t xml:space="preserve">   18: ```</w:t>
+        <w:t xml:space="preserve">   18: docs/OMB_Portfolio_Builder_Important_Code_Reference.docx</w:t>
         <w:br/>
-        <w:t xml:space="preserve">   19: </w:t>
+        <w:t xml:space="preserve">   19: docs/OMB_Portfolio_Builder_Important_Code_Reference.pdf</w:t>
         <w:br/>
-        <w:t xml:space="preserve">   20: It explains the high-level design, generated block diagrams, software-engineering decisions, shell commands, programming syntax, how the important files communicate, what each build tool owns, GitHub workflows, Electron, the installer, caching, API endpoints, data contracts, frontend/backend/AI/Cloudflare layers, the website, the parser, publishing, compiler tools, generated function inventories, and file-by-file repository notes. The generator writes source-focused Word documents to `docs/code-reference-docx` and PDFs to `docs/code-reference-pdf`. It also writes a focused important-code reference for the behavior-driving files to `docs/important-code-reference-docx` and `docs/important-code-reference-pdf`.</w:t>
+        <w:t xml:space="preserve">   20: ```</w:t>
         <w:br/>
         <w:t xml:space="preserve">   21: </w:t>
         <w:br/>
-        <w:t xml:space="preserve">   22: ## Install</w:t>
+        <w:t xml:space="preserve">   22: The complete guide explains the whole system: high-level design, generated block diagrams, software-engineering decisions, shell commands, programming syntax, how the important files communicate, what each build tool owns, GitHub workflows, Electron, the installer, caching, API endpoints, data contracts, frontend/backend/AI/Cloudflare layers, the website, the parser, publishing, and compiler tools.</w:t>
         <w:br/>
         <w:t xml:space="preserve">   23: </w:t>
         <w:br/>
-        <w:t xml:space="preserve">   24: Download the latest Windows installer or portable executable from:</w:t>
+        <w:t xml:space="preserve">   24: File-specific explanations live in generated Word/PDF references:</w:t>
         <w:br/>
         <w:t xml:space="preserve">   25: </w:t>
         <w:br/>
-        <w:t xml:space="preserve">   26: ```text</w:t>
+        <w:t xml:space="preserve">   26: - `docs/file-reference-docx` and `docs/file-reference-pdf` contain one document for each primary tracked repository file.</w:t>
         <w:br/>
-        <w:t xml:space="preserve">   27: https://github.com/otienomaurice/omb-portfolio-builder/releases/latest</w:t>
+        <w:t xml:space="preserve">   27: - `docs/code-reference-docx` and `docs/code-reference-pdf` contain source-focused documents with discovered function detail.</w:t>
         <w:br/>
-        <w:t xml:space="preserve">   28: ```</w:t>
+        <w:t xml:space="preserve">   28: - `docs/important-code-reference-docx` and `docs/important-code-reference-pdf` contain the curated set of behavior-driving files to study first.</w:t>
         <w:br/>
         <w:t xml:space="preserve">   29: </w:t>
         <w:br/>
-        <w:t xml:space="preserve">   30: Use:</w:t>
+        <w:t xml:space="preserve">   30: The complete guide should stay system-level. The file-specific documents explain each file's contents, functions, important variables, calls, returns, source excerpts, metadata, and safe-change notes.</w:t>
         <w:br/>
         <w:t xml:space="preserve">   31: </w:t>
         <w:br/>
-        <w:t xml:space="preserve">   32: - `OMB-Portfolio-Builder-Setup-latest-x64.exe` for the Windows installer.</w:t>
+        <w:t xml:space="preserve">   32: ## Install</w:t>
         <w:br/>
-        <w:t xml:space="preserve">   33: - `OMB-Portfolio-Builder-Portable-latest-x64.exe` when you want to run without installing.</w:t>
+        <w:t xml:space="preserve">   33: </w:t>
         <w:br/>
-        <w:t xml:space="preserve">   34: </w:t>
+        <w:t xml:space="preserve">   34: Download the latest Windows installer or portable executable from:</w:t>
         <w:br/>
-        <w:t xml:space="preserve">   35: The normal installer default is a per-user AppData location:</w:t>
+        <w:t xml:space="preserve">   35: </w:t>
         <w:br/>
-        <w:t xml:space="preserve">   36: </w:t>
+        <w:t xml:space="preserve">   36: ```text</w:t>
         <w:br/>
-        <w:t xml:space="preserve">   37: ```text</w:t>
+        <w:t xml:space="preserve">   37: https://github.com/otienomaurice/omb-portfolio-builder/releases/latest</w:t>
         <w:br/>
-        <w:t xml:space="preserve">   38: C:\Users\&lt;you&gt;\AppData\Local\Programs\OMB Portfolio Builder</w:t>
+        <w:t xml:space="preserve">   38: ```</w:t>
         <w:br/>
-        <w:t xml:space="preserve">   39: ```</w:t>
+        <w:t xml:space="preserve">   39: </w:t>
         <w:br/>
-        <w:t xml:space="preserve">   40: </w:t>
+        <w:t xml:space="preserve">   40: Use:</w:t>
         <w:br/>
-        <w:t xml:space="preserve">   41: The installed application executable is:</w:t>
+        <w:t xml:space="preserve">   41: </w:t>
         <w:br/>
-        <w:t xml:space="preserve">   42: </w:t>
+        <w:t xml:space="preserve">   42: - `OMB-Portfolio-Builder-Setup-latest-x64.exe` for the Windows installer.</w:t>
         <w:br/>
-        <w:t xml:space="preserve">   43: ```text</w:t>
+        <w:t xml:space="preserve">   43: - `OMB-Portfolio-Builder-Portable-latest-x64.exe` when you want to run without installing.</w:t>
         <w:br/>
-        <w:t xml:space="preserve">   44: C:\Users\&lt;you&gt;\AppData\Local\Programs\OMB Portfolio Builder\OMB Portfolio Builder.exe</w:t>
+        <w:t xml:space="preserve">   44: </w:t>
         <w:br/>
-        <w:t xml:space="preserve">   45: ```</w:t>
+        <w:t xml:space="preserve">   45: The normal installer default is a per-user AppData location:</w:t>
         <w:br/>
         <w:t xml:space="preserve">   46: </w:t>
         <w:br/>
-        <w:t xml:space="preserve">   47: The installer uses a Windows wizard with Back, Next, Cancel, progress, and Finish. It can create Desktop and Start Menu shortcuts, and it writes a normal Windows uninstall entry. The default per-user install does not write into `C:\Program Files`, so normal app updates can run without a Windows administrator prompt.</w:t>
+        <w:t xml:space="preserve">   47: ```text</w:t>
         <w:br/>
-        <w:t xml:space="preserve">   48: </w:t>
+        <w:t xml:space="preserve">   48: C:\Users\&lt;you&gt;\AppData\Local\Programs\OMB Portfolio Builder</w:t>
         <w:br/>
-        <w:t xml:space="preserve">   49: Installed users do not need Node.js or pnpm. The packaged desktop app includes its runtime. Git for Windows with Git Credential Manager is needed only for publishing to a Git repository. If Git or Git Credential Manager is missing, setup can install Git for Windows; compatible existing tools are skipped rather than removed.</w:t>
+        <w:t xml:space="preserve">   49: ```</w:t>
         <w:br/>
         <w:t xml:space="preserve">   50: </w:t>
         <w:br/>
-        <w:t xml:space="preserve">   51: ## Updates</w:t>
+        <w:t xml:space="preserve">   51: The installed application executable is:</w:t>
         <w:br/>
         <w:t xml:space="preserve">   52: </w:t>
         <w:br/>
-        <w:t xml:space="preserve">   53: The app checks GitHub Releases for newer builder versions. When a newer release exists, the app shows an update dialog. Choosing **Update** downloads the installer, closes the running builder, updates the existing installation in place, and reopens the updated app.</w:t>
+        <w:t xml:space="preserve">   53: ```text</w:t>
         <w:br/>
-        <w:t xml:space="preserve">   54: </w:t>
+        <w:t xml:space="preserve">   54: C:\Users\&lt;you&gt;\AppData\Local\Programs\OMB Portfolio Builder\OMB Portfolio Builder.exe</w:t>
         <w:br/>
-        <w:t xml:space="preserve">   55: Setup treats an existing install as an update target, not a second installation. It checks the current user's install first, then legacy machine-wide records, uses the detected install location for updates, avoids creating duplicate builder copies, and stops when the installed version is already current or newer.</w:t>
+        <w:t xml:space="preserve">   55: ```</w:t>
         <w:br/>
         <w:t xml:space="preserve">   56: </w:t>
         <w:br/>
-        <w:t xml:space="preserve">   57: Older releases remain available at:</w:t>
+        <w:t xml:space="preserve">   57: The installer uses a Windows wizard with Back, Next, Cancel, progress, and Finish. It can create Desktop and Start Menu shortcuts, and it writes a normal Windows uninstall entry. The default per-user install does not write into `C:\Program Files`, so normal app updates can run without a Windows administrator prompt.</w:t>
         <w:br/>
         <w:t xml:space="preserve">   58: </w:t>
         <w:br/>
-        <w:t xml:space="preserve">   59: ```text</w:t>
+        <w:t xml:space="preserve">   59: Installed users do not need Node.js or pnpm. The packaged desktop app includes its runtime. Git for Windows with Git Credential Manager is needed only for publishing to a Git repository. If Git or Git Credential Manager is missing, setup can install Git for Windows; compatible existing tools are skipped rather than removed.</w:t>
         <w:br/>
-        <w:t xml:space="preserve">   60: https://github.com/otienomaurice/omb-portfolio-builder/releases</w:t>
+        <w:t xml:space="preserve">   60: </w:t>
         <w:br/>
-        <w:t xml:space="preserve">   61: ```</w:t>
+        <w:t xml:space="preserve">   61: ## Updates</w:t>
         <w:br/>
         <w:t xml:space="preserve">   62: </w:t>
         <w:br/>
-        <w:t xml:space="preserve">   63: ## Local Workspaces</w:t>
+        <w:t xml:space="preserve">   63: The app checks GitHub Releases for newer builder versions. When a newer release exists, the app shows an update dialog. Choosing **Update** downloads the installer, closes the running builder, updates the existing installation in place, and reopens the updated app.</w:t>
         <w:br/>
         <w:t xml:space="preserve">   64: </w:t>
         <w:br/>
-        <w:t xml:space="preserve">   65: On Windows, the app keeps application files and editable content under AppData:</w:t>
+        <w:t xml:space="preserve">   65: Setup treats an existing install as an update target, not a second installation. It checks the current user's install first, then legacy machine-wide records, uses the detected install location for updates, avoids creating duplicate builder copies, and stops when the installed version is already current or newer.</w:t>
         <w:br/>
         <w:t xml:space="preserve">   66: </w:t>
         <w:br/>
-        <w:t xml:space="preserve">   67: - `C:\Users\&lt;you&gt;\AppData\Local\Programs\OMB Portfolio Builder` stores the installed desktop application.</w:t>
+        <w:t xml:space="preserve">   67: Older releases remain available at:</w:t>
         <w:br/>
-        <w:t xml:space="preserve">   68: - `C:\Users\&lt;you&gt;\AppData\Local\OMB Portfolio Builder\builder` stores the builder workspace, local drafts, uploaded files, templates, previews, and editing tools.</w:t>
+        <w:t xml:space="preserve">   68: </w:t>
         <w:br/>
-        <w:t xml:space="preserve">   69: - `C:\Users\&lt;you&gt;\AppData\Local\OMB Portfolio Builder\portfolio` stores the publish mirror used by Git-based publishing.</w:t>
+        <w:t xml:space="preserve">   69: ```text</w:t>
         <w:br/>
-        <w:t xml:space="preserve">   70: - `C:\Users\&lt;you&gt;\AppData\Local\OMB Portfolio Builder\compile-code` stores project compile-workspace source files and run folders created by the Compile Code tool.</w:t>
+        <w:t xml:space="preserve">   70: https://github.com/otienomaurice/omb-portfolio-builder/releases</w:t>
         <w:br/>
-        <w:t xml:space="preserve">   71: </w:t>
+        <w:t xml:space="preserve">   71: ```</w:t>
         <w:br/>
-        <w:t xml:space="preserve">   72: The installer and updater treat the AppData builder and portfolio folders as managed workspaces, not duplicate app installs.</w:t>
+        <w:t xml:space="preserve">   72:</w:t>
       </w:r>
     </w:p>
     <w:p>

</xml_diff>